<commit_message>
Finalize report updates and build stability fixes
</commit_message>
<xml_diff>
--- a/Aarti Ravikumar - Project Progress Report 1 - 19386390.docx
+++ b/Aarti Ravikumar - Project Progress Report 1 - 19386390.docx
@@ -167,7 +167,7 @@
         <w:rPr>
           <w:rFonts w:ascii="Helvetica Light" w:hAnsi="Helvetica Light" w:cs="Helvetica Light"/>
         </w:rPr>
-        <w:t xml:space="preserve">So far, I have built Aether as a </w:t>
+        <w:t xml:space="preserve">In this reporting period, I made measurable progress by building Aether as a </w:t>
       </w:r>
       <w:proofErr w:type="spellStart"/>
       <w:r>
@@ -181,15 +181,29 @@
         <w:rPr>
           <w:rFonts w:ascii="Helvetica Light" w:hAnsi="Helvetica Light" w:cs="Helvetica Light"/>
         </w:rPr>
-        <w:t xml:space="preserve"> with a Next.js frontend and a Node.js backend, with TypeScript and Jest integrated into the workflow.</w:t>
-      </w:r>
-    </w:p>
-    <w:p>
-      <w:r>
-        <w:rPr>
-          <w:rFonts w:ascii="Helvetica Light" w:hAnsi="Helvetica Light" w:cs="Helvetica Light"/>
-        </w:rPr>
-        <w:t xml:space="preserve">I also created a focused </w:t>
+        <w:t xml:space="preserve"> with a Next.js frontend and a Node.js </w:t>
+      </w:r>
+      <w:proofErr w:type="gramStart"/>
+      <w:r>
+        <w:rPr>
+          <w:rFonts w:ascii="Helvetica Light" w:hAnsi="Helvetica Light" w:cs="Helvetica Light"/>
+        </w:rPr>
+        <w:t>backend, and</w:t>
+      </w:r>
+      <w:proofErr w:type="gramEnd"/>
+      <w:r>
+        <w:rPr>
+          <w:rFonts w:ascii="Helvetica Light" w:hAnsi="Helvetica Light" w:cs="Helvetica Light"/>
+        </w:rPr>
+        <w:t xml:space="preserve"> integrating TypeScript and Jest into the workflow.</w:t>
+      </w:r>
+    </w:p>
+    <w:p>
+      <w:r>
+        <w:rPr>
+          <w:rFonts w:ascii="Helvetica Light" w:hAnsi="Helvetica Light" w:cs="Helvetica Light"/>
+        </w:rPr>
+        <w:t xml:space="preserve">I created and validated a focused </w:t>
       </w:r>
       <w:proofErr w:type="spellStart"/>
       <w:r>
@@ -203,154 +217,113 @@
         <w:rPr>
           <w:rFonts w:ascii="Helvetica Light" w:hAnsi="Helvetica Light" w:cs="Helvetica Light"/>
         </w:rPr>
-        <w:t xml:space="preserve"> branch where the site keeps only the Home and Mentors pages, along with all required support files for routing, layout, metadata, and navigation.</w:t>
-      </w:r>
-    </w:p>
-    <w:p>
-      <w:r>
-        <w:rPr>
-          <w:rFonts w:ascii="Helvetica Light" w:hAnsi="Helvetica Light" w:cs="Helvetica Light"/>
-        </w:rPr>
-        <w:t xml:space="preserve">I updated page flags and navigation </w:t>
+        <w:t xml:space="preserve"> branch where the website scope is intentionally reduced to the Home and Mentors pages, while preserving required support files for routing, layout, metadata, and navigation.</w:t>
+      </w:r>
+    </w:p>
+    <w:p>
+      <w:r>
+        <w:rPr>
+          <w:rFonts w:ascii="Helvetica Light" w:hAnsi="Helvetica Light" w:cs="Helvetica Light"/>
+        </w:rPr>
+        <w:t>I completed technical cleanup by aligning page-flag logic and shared navigation behavior across UI and machine-readable routes, including sitemap and robots.</w:t>
+      </w:r>
+    </w:p>
+    <w:p>
+      <w:r>
+        <w:rPr>
+          <w:rFonts w:ascii="Helvetica Light" w:hAnsi="Helvetica Light" w:cs="Helvetica Light"/>
+        </w:rPr>
+        <w:t>Current quality results confirm stability: frontend and backend tests pass, and the frontend production build compiles successfully.</w:t>
+      </w:r>
+    </w:p>
+    <w:p>
+      <w:r>
+        <w:rPr>
+          <w:rFonts w:ascii="Helvetica Light" w:hAnsi="Helvetica Light" w:cs="Helvetica Light"/>
+        </w:rPr>
+        <w:lastRenderedPageBreak/>
+        <w:t>The result I am most proud of is simplifying scope without losing reliability, which shows clear progress toward a maintainable final project.</w:t>
+      </w:r>
+    </w:p>
+    <w:p/>
+    <w:p/>
+    <w:p/>
+    <w:p/>
+    <w:p/>
+    <w:p/>
+    <w:p/>
+    <w:p/>
+    <w:p/>
+    <w:p/>
+    <w:p>
+      <w:r>
+        <w:rPr>
+          <w:rFonts w:ascii="Helvetica Light" w:hAnsi="Helvetica Light" w:cs="Helvetica Light"/>
+        </w:rPr>
+        <w:t>3. What You Are Currently Working On</w:t>
+      </w:r>
+    </w:p>
+    <w:p>
+      <w:r>
+        <w:rPr>
+          <w:rFonts w:ascii="Helvetica Light" w:hAnsi="Helvetica Light" w:cs="Helvetica Light"/>
+        </w:rPr>
+        <w:t>Write 2–4 sentences below, explaining:</w:t>
+      </w:r>
+    </w:p>
+    <w:p>
+      <w:r>
+        <w:rPr>
+          <w:rFonts w:ascii="Helvetica Light" w:hAnsi="Helvetica Light" w:cs="Helvetica Light"/>
+        </w:rPr>
+        <w:t xml:space="preserve">        •       What feature are you building right now?</w:t>
+      </w:r>
+    </w:p>
+    <w:p>
+      <w:r>
+        <w:rPr>
+          <w:rFonts w:ascii="Helvetica Light" w:hAnsi="Helvetica Light" w:cs="Helvetica Light"/>
+        </w:rPr>
+        <w:t xml:space="preserve">        •       What is your next step?</w:t>
+      </w:r>
+    </w:p>
+    <w:p/>
+    <w:p>
+      <w:r>
+        <w:rPr>
+          <w:rFonts w:ascii="Helvetica Light" w:hAnsi="Helvetica Light" w:cs="Helvetica Light"/>
+        </w:rPr>
+        <w:t xml:space="preserve">I am currently polishing the simplified Home + Mentors experience to ensure it is clean, stable, and </w:t>
       </w:r>
       <w:proofErr w:type="gramStart"/>
       <w:r>
         <w:rPr>
           <w:rFonts w:ascii="Helvetica Light" w:hAnsi="Helvetica Light" w:cs="Helvetica Light"/>
         </w:rPr>
-        <w:t>logic</w:t>
+        <w:t>submission-ready</w:t>
       </w:r>
       <w:proofErr w:type="gramEnd"/>
       <w:r>
         <w:rPr>
           <w:rFonts w:ascii="Helvetica Light" w:hAnsi="Helvetica Light" w:cs="Helvetica Light"/>
         </w:rPr>
-        <w:t xml:space="preserve"> so behavior stays consistent across the header, footer, sitemap, and </w:t>
-      </w:r>
-      <w:proofErr w:type="gramStart"/>
-      <w:r>
-        <w:rPr>
-          <w:rFonts w:ascii="Helvetica Light" w:hAnsi="Helvetica Light" w:cs="Helvetica Light"/>
-        </w:rPr>
-        <w:t>robots</w:t>
-      </w:r>
-      <w:proofErr w:type="gramEnd"/>
-      <w:r>
-        <w:rPr>
-          <w:rFonts w:ascii="Helvetica Light" w:hAnsi="Helvetica Light" w:cs="Helvetica Light"/>
-        </w:rPr>
-        <w:t xml:space="preserve"> configuration.</w:t>
-      </w:r>
-    </w:p>
-    <w:p>
-      <w:r>
-        <w:rPr>
-          <w:rFonts w:ascii="Helvetica Light" w:hAnsi="Helvetica Light" w:cs="Helvetica Light"/>
-        </w:rPr>
-        <w:t>At this point, both frontend and backend tests are passing, and the frontend production build compiles successfully.</w:t>
-      </w:r>
-    </w:p>
-    <w:p>
-      <w:r>
-        <w:rPr>
-          <w:rFonts w:ascii="Helvetica Light" w:hAnsi="Helvetica Light" w:cs="Helvetica Light"/>
-        </w:rPr>
-        <w:t>What I am most proud of is reducing project complexity without breaking functionality, while preserving the same core tech stack.</w:t>
-      </w:r>
-    </w:p>
-    <w:p/>
-    <w:p/>
-    <w:p/>
-    <w:p/>
-    <w:p/>
-    <w:p/>
-    <w:p/>
-    <w:p/>
-    <w:p/>
-    <w:p/>
-    <w:p>
-      <w:r>
-        <w:rPr>
-          <w:rFonts w:ascii="Helvetica Light" w:hAnsi="Helvetica Light" w:cs="Helvetica Light"/>
-        </w:rPr>
-        <w:t>3. What You Are Currently Working On</w:t>
-      </w:r>
-    </w:p>
-    <w:p>
-      <w:r>
-        <w:rPr>
-          <w:rFonts w:ascii="Helvetica Light" w:hAnsi="Helvetica Light" w:cs="Helvetica Light"/>
-        </w:rPr>
-        <w:t>Write 2–4 sentences below, explaining:</w:t>
-      </w:r>
-    </w:p>
-    <w:p>
-      <w:r>
-        <w:rPr>
-          <w:rFonts w:ascii="Helvetica Light" w:hAnsi="Helvetica Light" w:cs="Helvetica Light"/>
-        </w:rPr>
-        <w:t xml:space="preserve">        •       What feature are you building right now?</w:t>
-      </w:r>
-    </w:p>
-    <w:p>
-      <w:r>
-        <w:rPr>
-          <w:rFonts w:ascii="Helvetica Light" w:hAnsi="Helvetica Light" w:cs="Helvetica Light"/>
-        </w:rPr>
-        <w:t xml:space="preserve">        •       What is your next step?</w:t>
-      </w:r>
-    </w:p>
-    <w:p/>
-    <w:p>
-      <w:r>
-        <w:rPr>
-          <w:rFonts w:ascii="Helvetica Light" w:hAnsi="Helvetica Light" w:cs="Helvetica Light"/>
-        </w:rPr>
-        <w:t xml:space="preserve">Right now, I am polishing the simplified Home + Mentors </w:t>
-      </w:r>
-      <w:proofErr w:type="gramStart"/>
-      <w:r>
-        <w:rPr>
-          <w:rFonts w:ascii="Helvetica Light" w:hAnsi="Helvetica Light" w:cs="Helvetica Light"/>
-        </w:rPr>
-        <w:t>version</w:t>
-      </w:r>
-      <w:proofErr w:type="gramEnd"/>
-      <w:r>
-        <w:rPr>
-          <w:rFonts w:ascii="Helvetica Light" w:hAnsi="Helvetica Light" w:cs="Helvetica Light"/>
-        </w:rPr>
-        <w:t xml:space="preserve"> so it is clean, stable, and ready for submission.</w:t>
-      </w:r>
-    </w:p>
-    <w:p>
-      <w:r>
-        <w:rPr>
-          <w:rFonts w:ascii="Helvetica Light" w:hAnsi="Helvetica Light" w:cs="Helvetica Light"/>
-        </w:rPr>
-        <w:t>My next step is to improve the content and copy on those two pages, then add updated screenshots and deployment notes.</w:t>
-      </w:r>
-    </w:p>
-    <w:p>
-      <w:r>
-        <w:rPr>
-          <w:rFonts w:ascii="Helvetica Light" w:hAnsi="Helvetica Light" w:cs="Helvetica Light"/>
-        </w:rPr>
-        <w:t xml:space="preserve">After that, I plan to add features </w:t>
-      </w:r>
-      <w:proofErr w:type="gramStart"/>
-      <w:r>
-        <w:rPr>
-          <w:rFonts w:ascii="Helvetica Light" w:hAnsi="Helvetica Light" w:cs="Helvetica Light"/>
-        </w:rPr>
-        <w:t>incrementally</w:t>
-      </w:r>
-      <w:proofErr w:type="gramEnd"/>
-      <w:r>
-        <w:rPr>
-          <w:rFonts w:ascii="Helvetica Light" w:hAnsi="Helvetica Light" w:cs="Helvetica Light"/>
-        </w:rPr>
-        <w:t xml:space="preserve"> so each update is tested and easier to maintain.</w:t>
+        <w:t>.</w:t>
+      </w:r>
+    </w:p>
+    <w:p>
+      <w:r>
+        <w:rPr>
+          <w:rFonts w:ascii="Helvetica Light" w:hAnsi="Helvetica Light" w:cs="Helvetica Light"/>
+        </w:rPr>
+        <w:t>My immediate next step is improving content quality and page copy on those routes, followed by updated screenshots and deployment notes for evidence.</w:t>
+      </w:r>
+    </w:p>
+    <w:p>
+      <w:r>
+        <w:rPr>
+          <w:rFonts w:ascii="Helvetica Light" w:hAnsi="Helvetica Light" w:cs="Helvetica Light"/>
+        </w:rPr>
+        <w:t>After this pass, I will add features incrementally so each change can be tested, reviewed, and stabilized before moving forward.</w:t>
       </w:r>
     </w:p>
     <w:p/>
@@ -393,6 +366,7 @@
         <w:rPr>
           <w:rFonts w:ascii="Helvetica Light" w:hAnsi="Helvetica Light" w:cs="Helvetica Light"/>
         </w:rPr>
+        <w:lastRenderedPageBreak/>
         <w:t xml:space="preserve">        •       A bug you can’t fix</w:t>
       </w:r>
     </w:p>
@@ -401,7 +375,6 @@
         <w:rPr>
           <w:rFonts w:ascii="Helvetica Light" w:hAnsi="Helvetica Light" w:cs="Helvetica Light"/>
         </w:rPr>
-        <w:lastRenderedPageBreak/>
         <w:t>Note: Be specific. Don’t just type “this feature is hard because I don’t know how to do it.”</w:t>
       </w:r>
     </w:p>
@@ -411,39 +384,39 @@
         <w:rPr>
           <w:rFonts w:ascii="Helvetica Light" w:hAnsi="Helvetica Light" w:cs="Helvetica Light"/>
         </w:rPr>
-        <w:t>One challenge I am actively working through is keeping a consistent look and feel while the project is still changing quickly.</w:t>
-      </w:r>
-    </w:p>
-    <w:p>
-      <w:r>
-        <w:rPr>
-          <w:rFonts w:ascii="Helvetica Light" w:hAnsi="Helvetica Light" w:cs="Helvetica Light"/>
-        </w:rPr>
-        <w:t>Because I want the UI to stay generic and reusable, I rely on shared theme tokens, reusable layout components, and common section patterns instead of page-specific styling.</w:t>
-      </w:r>
-    </w:p>
-    <w:p>
-      <w:r>
-        <w:rPr>
-          <w:rFonts w:ascii="Helvetica Light" w:hAnsi="Helvetica Light" w:cs="Helvetica Light"/>
-        </w:rPr>
-        <w:t>The difficult part is that when one theme variable or reusable component changes, it can affect multiple areas at once (for example spacing, contrast, or visual hierarchy).</w:t>
-      </w:r>
-    </w:p>
-    <w:p>
-      <w:r>
-        <w:rPr>
-          <w:rFonts w:ascii="Helvetica Light" w:hAnsi="Helvetica Light" w:cs="Helvetica Light"/>
-        </w:rPr>
-        <w:t>I am addressing this iteratively by making smaller UI updates, validating each change in the Home and Mentors flow, and then stabilizing before introducing new design changes.</w:t>
-      </w:r>
-    </w:p>
-    <w:p>
-      <w:r>
-        <w:rPr>
-          <w:rFonts w:ascii="Helvetica Light" w:hAnsi="Helvetica Light" w:cs="Helvetica Light"/>
-        </w:rPr>
-        <w:t>This approach is helping me move toward a cleaner, more stable interface without losing consistency.</w:t>
+        <w:t>One active challenge is maintaining a consistent visual language while the project is still evolving quickly.</w:t>
+      </w:r>
+    </w:p>
+    <w:p>
+      <w:r>
+        <w:rPr>
+          <w:rFonts w:ascii="Helvetica Light" w:hAnsi="Helvetica Light" w:cs="Helvetica Light"/>
+        </w:rPr>
+        <w:t>To keep the interface generic and reusable, I am using shared theme tokens, layout components, and common section patterns instead of page-specific styling.</w:t>
+      </w:r>
+    </w:p>
+    <w:p>
+      <w:r>
+        <w:rPr>
+          <w:rFonts w:ascii="Helvetica Light" w:hAnsi="Helvetica Light" w:cs="Helvetica Light"/>
+        </w:rPr>
+        <w:t>The specific issue is that one theme or component change can affect multiple areas at once (for example spacing, contrast, and hierarchy), which can introduce instability.</w:t>
+      </w:r>
+    </w:p>
+    <w:p>
+      <w:r>
+        <w:rPr>
+          <w:rFonts w:ascii="Helvetica Light" w:hAnsi="Helvetica Light" w:cs="Helvetica Light"/>
+        </w:rPr>
+        <w:t>I am addressing this through iterative stabilization: apply a small UI change, validate Home and Mentors behavior, then proceed only after confirming the previous change is stable.</w:t>
+      </w:r>
+    </w:p>
+    <w:p>
+      <w:r>
+        <w:rPr>
+          <w:rFonts w:ascii="Helvetica Light" w:hAnsi="Helvetica Light" w:cs="Helvetica Light"/>
+        </w:rPr>
+        <w:t>This method is improving consistency and reducing regression risk over time.</w:t>
       </w:r>
     </w:p>
     <w:p/>
@@ -930,15 +903,15 @@
         <w:rPr>
           <w:rFonts w:ascii="Helvetica Light" w:hAnsi="Helvetica Light" w:cs="Helvetica Light"/>
         </w:rPr>
-        <w:t>I picked this Home page section because it was one of the hardest parts for me to design in a clean, reusable way.</w:t>
-      </w:r>
-    </w:p>
-    <w:p>
-      <w:r>
-        <w:rPr>
-          <w:rFonts w:ascii="Helvetica Light" w:hAnsi="Helvetica Light" w:cs="Helvetica Light"/>
-        </w:rPr>
-        <w:t>What makes it interesting is that one source of truth (</w:t>
+        <w:t>I selected this Home page section because it demonstrates one of the most challenging and valuable architectural patterns in the project.</w:t>
+      </w:r>
+    </w:p>
+    <w:p>
+      <w:r>
+        <w:rPr>
+          <w:rFonts w:ascii="Helvetica Light" w:hAnsi="Helvetica Light" w:cs="Helvetica Light"/>
+        </w:rPr>
+        <w:t>The key idea is a single source of truth (`</w:t>
       </w:r>
       <w:proofErr w:type="spellStart"/>
       <w:r>
@@ -952,31 +925,31 @@
         <w:rPr>
           <w:rFonts w:ascii="Helvetica Light" w:hAnsi="Helvetica Light" w:cs="Helvetica Light"/>
         </w:rPr>
-        <w:t>) controls both what users see on the screen and what search engines read through JSON-LD.</w:t>
-      </w:r>
-    </w:p>
-    <w:p>
-      <w:r>
-        <w:rPr>
-          <w:rFonts w:ascii="Helvetica Light" w:hAnsi="Helvetica Light" w:cs="Helvetica Light"/>
-        </w:rPr>
-        <w:t>That matters to me because I did not want the app to "say" one thing to students and a different thing to search engines.</w:t>
-      </w:r>
-    </w:p>
-    <w:p>
-      <w:r>
-        <w:rPr>
-          <w:rFonts w:ascii="Helvetica Light" w:hAnsi="Helvetica Light" w:cs="Helvetica Light"/>
-        </w:rPr>
-        <w:t>I also put real effort into keeping Header and Footer global through layout components, because they make the app feel stable: the Header gives students predictable navigation and trust cues, and the Footer keeps safety messaging and important links visible from every page.</w:t>
-      </w:r>
-    </w:p>
-    <w:p>
-      <w:r>
-        <w:rPr>
-          <w:rFonts w:ascii="Helvetica Light" w:hAnsi="Helvetica Light" w:cs="Helvetica Light"/>
-        </w:rPr>
-        <w:t>Personally, this section taught me how strong architecture choices can reduce future bugs, since adding or updating sections in one place now automatically flows into navigation, metadata, and page structure.</w:t>
+        <w:t>`) that drives both user-facing navigation content and structured JSON-LD metadata for search engines.</w:t>
+      </w:r>
+    </w:p>
+    <w:p>
+      <w:r>
+        <w:rPr>
+          <w:rFonts w:ascii="Helvetica Light" w:hAnsi="Helvetica Light" w:cs="Helvetica Light"/>
+        </w:rPr>
+        <w:t>This is important because it keeps what students see and what search engines index aligned, improving trust, clarity, and discoverability.</w:t>
+      </w:r>
+    </w:p>
+    <w:p>
+      <w:r>
+        <w:rPr>
+          <w:rFonts w:ascii="Helvetica Light" w:hAnsi="Helvetica Light" w:cs="Helvetica Light"/>
+        </w:rPr>
+        <w:t>The global Header and Footer design reinforces this architecture: the Header provides consistent navigation and trust cues, while the Footer keeps safety guidance, machine-readable links, and project identity visible on every page.</w:t>
+      </w:r>
+    </w:p>
+    <w:p>
+      <w:r>
+        <w:rPr>
+          <w:rFonts w:ascii="Helvetica Light" w:hAnsi="Helvetica Light" w:cs="Helvetica Light"/>
+        </w:rPr>
+        <w:t>From a technical standpoint, this pattern reduces regression risk because updates in one location propagate automatically to UI structure, navigation behavior, and metadata outputs.</w:t>
       </w:r>
     </w:p>
     <w:p/>
@@ -1121,119 +1094,14 @@
         <w:rPr>
           <w:rFonts w:ascii="Helvetica Light" w:hAnsi="Helvetica Light" w:cs="Helvetica Light"/>
         </w:rPr>
-        <w:t xml:space="preserve"> run dev, the frontend starts at http://localhost:3000 and serves the Home and Mentors pages, with working navigation and metadata routes.</w:t>
-      </w:r>
-    </w:p>
-    <w:p/>
-    <w:p/>
-    <w:p/>
-    <w:p/>
-    <w:p/>
-    <w:p/>
-    <w:p/>
-    <w:p/>
-    <w:p/>
-    <w:p/>
-    <w:p/>
-    <w:p/>
-    <w:p/>
-    <w:p/>
-    <w:p/>
-    <w:p/>
-    <w:p/>
-    <w:p/>
-    <w:p/>
-    <w:p/>
-    <w:p/>
-    <w:p/>
-    <w:p/>
-    <w:p/>
-    <w:p/>
-    <w:p/>
-    <w:p/>
-    <w:p/>
-    <w:p/>
-    <w:p/>
-    <w:p/>
-    <w:p/>
-    <w:p/>
-    <w:p/>
-    <w:p/>
-    <w:p/>
-    <w:p/>
-    <w:p/>
-    <w:p/>
-    <w:p/>
-    <w:p>
-      <w:r>
-        <w:rPr>
-          <w:rFonts w:ascii="Helvetica Light" w:hAnsi="Helvetica Light" w:cs="Helvetica Light"/>
-        </w:rPr>
-        <w:t>How This Will Be Graded</w:t>
-      </w:r>
-    </w:p>
-    <w:p>
-      <w:r>
-        <w:rPr>
-          <w:rFonts w:ascii="Helvetica Light" w:hAnsi="Helvetica Light" w:cs="Helvetica Light"/>
-        </w:rPr>
-        <w:t>You will be graded on:</w:t>
-      </w:r>
-    </w:p>
-    <w:p>
-      <w:r>
-        <w:rPr>
-          <w:rFonts w:ascii="Helvetica Light" w:hAnsi="Helvetica Light" w:cs="Helvetica Light"/>
-        </w:rPr>
-        <w:t xml:space="preserve">        •       Effort (Did you </w:t>
-      </w:r>
-      <w:proofErr w:type="gramStart"/>
-      <w:r>
-        <w:rPr>
-          <w:rFonts w:ascii="Helvetica Light" w:hAnsi="Helvetica Light" w:cs="Helvetica Light"/>
-        </w:rPr>
-        <w:t>actually work</w:t>
-      </w:r>
-      <w:proofErr w:type="gramEnd"/>
-      <w:r>
-        <w:rPr>
-          <w:rFonts w:ascii="Helvetica Light" w:hAnsi="Helvetica Light" w:cs="Helvetica Light"/>
-        </w:rPr>
-        <w:t xml:space="preserve"> on your project over the past 3 days?)</w:t>
-      </w:r>
-    </w:p>
-    <w:p>
-      <w:r>
-        <w:rPr>
-          <w:rFonts w:ascii="Helvetica Light" w:hAnsi="Helvetica Light" w:cs="Helvetica Light"/>
-        </w:rPr>
-        <w:t xml:space="preserve">        •       Progress (Is something being built?)</w:t>
-      </w:r>
-    </w:p>
-    <w:p>
-      <w:r>
-        <w:rPr>
-          <w:rFonts w:ascii="Helvetica Light" w:hAnsi="Helvetica Light" w:cs="Helvetica Light"/>
-        </w:rPr>
-        <w:t xml:space="preserve">        •       Clarity (Can you explain your work?)</w:t>
-      </w:r>
-    </w:p>
-    <w:p>
-      <w:r>
-        <w:rPr>
-          <w:rFonts w:ascii="Helvetica Light" w:hAnsi="Helvetica Light" w:cs="Helvetica Light"/>
-        </w:rPr>
-        <w:t xml:space="preserve">        •       Specificity (Are your answers detailed or vague?)</w:t>
-      </w:r>
-    </w:p>
-    <w:p>
-      <w:r>
-        <w:rPr>
-          <w:rFonts w:ascii="Helvetica Light" w:hAnsi="Helvetica Light" w:cs="Helvetica Light"/>
-        </w:rPr>
-        <w:t>Your final project at the end of this month will be worth 50% of your project grade for this quarter, the sum of these project reports will be worth 40%, and you’ll have a peer review + project showcase at the end worth the final 10%. Depending on your performance in all 3 areas, I may or may not award up to an additional 5% extra credit towards your final quarter grade.</w:t>
-      </w:r>
-    </w:p>
+        <w:t xml:space="preserve"> run dev, the frontend starts at http://localhost:3000 and serves only the Home and Mentors pages, with functioning navigation and metadata routes.</w:t>
+      </w:r>
+    </w:p>
+    <w:p/>
+    <w:p/>
+    <w:p/>
+    <w:p/>
+    <w:p/>
     <w:sectPr>
       <w:pgSz w:w="12240" w:h="15840"/>
       <w:pgMar w:top="1440" w:right="1440" w:bottom="1440" w:left="1440" w:header="720" w:footer="720" w:gutter="0"/>
@@ -1906,7 +1774,7 @@
 </file>
 
 <file path=customXml/itemProps1.xml><?xml version="1.0" encoding="utf-8"?>
-<ds:datastoreItem xmlns:ds="http://schemas.openxmlformats.org/officeDocument/2006/customXml" ds:itemID="{D4276F21-5092-EB4D-9BDF-2683F44425F0}">
+<ds:datastoreItem xmlns:ds="http://schemas.openxmlformats.org/officeDocument/2006/customXml" ds:itemID="{7FF4D098-0C04-1143-A5CE-D754B8BD555A}">
   <ds:schemaRefs>
     <ds:schemaRef ds:uri="http://schemas.apple.com/cocoa/2006/metadata"/>
   </ds:schemaRefs>

</xml_diff>